<commit_message>
[Fix] Change to OpenSource Library
</commit_message>
<xml_diff>
--- a/PTEducation.API/Templates/Template_Report.docx
+++ b/PTEducation.API/Templates/Template_Report.docx
@@ -54,7 +54,14 @@
           <w:b/>
           <w:sz w:val="26"/>
         </w:rPr>
-        <w:t xml:space="preserve"> [Date]</w:t>
+        <w:t xml:space="preserve"> </w:t>
+      </w:r>
+      <w:r>
+        <w:rPr>
+          <w:b/>
+          <w:sz w:val="26"/>
+        </w:rPr>
+        <w:t>{{Date}}</w:t>
       </w:r>
       <w:r>
         <w:rPr>
@@ -85,7 +92,7 @@
         <w:t xml:space="preserve"> HS: </w:t>
       </w:r>
       <w:r>
-        <w:t>[</w:t>
+        <w:t>{{</w:t>
       </w:r>
       <w:proofErr w:type="spellStart"/>
       <w:r>
@@ -93,7 +100,7 @@
       </w:r>
       <w:proofErr w:type="spellEnd"/>
       <w:r>
-        <w:t>]</w:t>
+        <w:t>}}</w:t>
       </w:r>
     </w:p>
     <w:tbl>
@@ -104,10 +111,10 @@
         <w:tblLook w:val="04A0" w:firstRow="1" w:lastRow="0" w:firstColumn="1" w:lastColumn="0" w:noHBand="0" w:noVBand="1"/>
       </w:tblPr>
       <w:tblGrid>
-        <w:gridCol w:w="1928"/>
-        <w:gridCol w:w="1950"/>
-        <w:gridCol w:w="1884"/>
-        <w:gridCol w:w="4426"/>
+        <w:gridCol w:w="1672"/>
+        <w:gridCol w:w="2306"/>
+        <w:gridCol w:w="1890"/>
+        <w:gridCol w:w="4320"/>
       </w:tblGrid>
       <w:tr>
         <w:trPr>
@@ -115,7 +122,7 @@
         </w:trPr>
         <w:tc>
           <w:tcPr>
-            <w:tcW w:w="1928" w:type="dxa"/>
+            <w:tcW w:w="1672" w:type="dxa"/>
             <w:shd w:val="clear" w:color="auto" w:fill="D9D9D9"/>
             <w:vAlign w:val="center"/>
           </w:tcPr>
@@ -134,7 +141,7 @@
         </w:tc>
         <w:tc>
           <w:tcPr>
-            <w:tcW w:w="1950" w:type="dxa"/>
+            <w:tcW w:w="2306" w:type="dxa"/>
             <w:shd w:val="clear" w:color="auto" w:fill="D9D9D9"/>
             <w:vAlign w:val="center"/>
           </w:tcPr>
@@ -155,7 +162,7 @@
         </w:tc>
         <w:tc>
           <w:tcPr>
-            <w:tcW w:w="1884" w:type="dxa"/>
+            <w:tcW w:w="1890" w:type="dxa"/>
             <w:shd w:val="clear" w:color="auto" w:fill="D9D9D9"/>
             <w:vAlign w:val="center"/>
           </w:tcPr>
@@ -174,7 +181,7 @@
         </w:tc>
         <w:tc>
           <w:tcPr>
-            <w:tcW w:w="4426" w:type="dxa"/>
+            <w:tcW w:w="4320" w:type="dxa"/>
             <w:shd w:val="clear" w:color="auto" w:fill="D9D9D9"/>
             <w:vAlign w:val="center"/>
           </w:tcPr>
@@ -271,373 +278,203 @@
         </w:trPr>
         <w:tc>
           <w:tcPr>
-            <w:tcW w:w="1928" w:type="dxa"/>
-            <w:vAlign w:val="center"/>
-          </w:tcPr>
-          <w:p>
-            <w:pPr>
-              <w:jc w:val="center"/>
-            </w:pPr>
-          </w:p>
-        </w:tc>
-        <w:tc>
-          <w:tcPr>
-            <w:tcW w:w="1950" w:type="dxa"/>
-            <w:vAlign w:val="center"/>
-          </w:tcPr>
-          <w:p>
-            <w:pPr>
-              <w:jc w:val="center"/>
-            </w:pPr>
-          </w:p>
-        </w:tc>
-        <w:tc>
-          <w:tcPr>
-            <w:tcW w:w="1884" w:type="dxa"/>
-            <w:vAlign w:val="center"/>
-          </w:tcPr>
-          <w:p>
-            <w:pPr>
-              <w:jc w:val="center"/>
-            </w:pPr>
-          </w:p>
-        </w:tc>
-        <w:tc>
-          <w:tcPr>
-            <w:tcW w:w="4426" w:type="dxa"/>
-            <w:vAlign w:val="center"/>
-          </w:tcPr>
-          <w:p/>
-        </w:tc>
-      </w:tr>
-      <w:tr>
-        <w:trPr>
-          <w:jc w:val="center"/>
-        </w:trPr>
-        <w:tc>
-          <w:tcPr>
-            <w:tcW w:w="1928" w:type="dxa"/>
-            <w:vAlign w:val="center"/>
-          </w:tcPr>
-          <w:p>
-            <w:pPr>
-              <w:jc w:val="center"/>
-            </w:pPr>
-          </w:p>
-        </w:tc>
-        <w:tc>
-          <w:tcPr>
-            <w:tcW w:w="1950" w:type="dxa"/>
-            <w:vAlign w:val="center"/>
-          </w:tcPr>
-          <w:p>
-            <w:pPr>
-              <w:jc w:val="center"/>
-            </w:pPr>
-          </w:p>
-        </w:tc>
-        <w:tc>
-          <w:tcPr>
-            <w:tcW w:w="1884" w:type="dxa"/>
-            <w:vAlign w:val="center"/>
-          </w:tcPr>
-          <w:p>
-            <w:pPr>
-              <w:jc w:val="center"/>
-            </w:pPr>
-          </w:p>
-        </w:tc>
-        <w:tc>
-          <w:tcPr>
-            <w:tcW w:w="4426" w:type="dxa"/>
-            <w:vAlign w:val="center"/>
-          </w:tcPr>
-          <w:p/>
-        </w:tc>
-      </w:tr>
-      <w:tr>
-        <w:trPr>
-          <w:jc w:val="center"/>
-        </w:trPr>
-        <w:tc>
-          <w:tcPr>
-            <w:tcW w:w="1928" w:type="dxa"/>
-            <w:vAlign w:val="center"/>
-          </w:tcPr>
-          <w:p>
-            <w:pPr>
-              <w:jc w:val="center"/>
-            </w:pPr>
-          </w:p>
-        </w:tc>
-        <w:tc>
-          <w:tcPr>
-            <w:tcW w:w="1950" w:type="dxa"/>
-            <w:vAlign w:val="center"/>
-          </w:tcPr>
-          <w:p>
-            <w:pPr>
-              <w:jc w:val="center"/>
-            </w:pPr>
-          </w:p>
-        </w:tc>
-        <w:tc>
-          <w:tcPr>
-            <w:tcW w:w="1884" w:type="dxa"/>
-            <w:vAlign w:val="center"/>
-          </w:tcPr>
-          <w:p>
-            <w:pPr>
-              <w:jc w:val="center"/>
-            </w:pPr>
-          </w:p>
-        </w:tc>
-        <w:tc>
-          <w:tcPr>
-            <w:tcW w:w="4426" w:type="dxa"/>
-            <w:vAlign w:val="center"/>
-          </w:tcPr>
-          <w:p/>
-        </w:tc>
-      </w:tr>
-      <w:tr>
-        <w:trPr>
-          <w:jc w:val="center"/>
-        </w:trPr>
-        <w:tc>
-          <w:tcPr>
-            <w:tcW w:w="1928" w:type="dxa"/>
+            <w:tcW w:w="1672" w:type="dxa"/>
             <w:vAlign w:val="center"/>
           </w:tcPr>
           <w:p>
             <w:pPr>
               <w:jc w:val="center"/>
               <w:rPr>
+                <w:bCs/>
                 <w:sz w:val="22"/>
               </w:rPr>
             </w:pPr>
+            <w:r>
+              <w:rPr>
+                <w:bCs/>
+                <w:sz w:val="22"/>
+              </w:rPr>
+              <w:t>{{</w:t>
+            </w:r>
+            <w:proofErr w:type="spellStart"/>
+            <w:r>
+              <w:rPr>
+                <w:bCs/>
+                <w:sz w:val="22"/>
+              </w:rPr>
+              <w:t>Scores</w:t>
+            </w:r>
+            <w:r>
+              <w:rPr>
+                <w:bCs/>
+                <w:sz w:val="22"/>
+              </w:rPr>
+              <w:t>.STT</w:t>
+            </w:r>
+            <w:proofErr w:type="spellEnd"/>
+            <w:r>
+              <w:rPr>
+                <w:bCs/>
+                <w:sz w:val="22"/>
+              </w:rPr>
+              <w:t>}}</w:t>
+            </w:r>
           </w:p>
         </w:tc>
         <w:tc>
           <w:tcPr>
-            <w:tcW w:w="1950" w:type="dxa"/>
-            <w:vAlign w:val="center"/>
-          </w:tcPr>
-          <w:p>
-            <w:pPr>
-              <w:jc w:val="center"/>
-            </w:pPr>
-          </w:p>
-        </w:tc>
-        <w:tc>
-          <w:tcPr>
-            <w:tcW w:w="1884" w:type="dxa"/>
-            <w:vAlign w:val="center"/>
-          </w:tcPr>
-          <w:p>
-            <w:pPr>
-              <w:jc w:val="center"/>
-            </w:pPr>
-          </w:p>
-        </w:tc>
-        <w:tc>
-          <w:tcPr>
-            <w:tcW w:w="4426" w:type="dxa"/>
-            <w:vAlign w:val="center"/>
-          </w:tcPr>
-          <w:p/>
-        </w:tc>
-      </w:tr>
-      <w:tr>
-        <w:trPr>
-          <w:jc w:val="center"/>
-        </w:trPr>
-        <w:tc>
-          <w:tcPr>
-            <w:tcW w:w="1928" w:type="dxa"/>
+            <w:tcW w:w="2306" w:type="dxa"/>
             <w:vAlign w:val="center"/>
           </w:tcPr>
           <w:p>
             <w:pPr>
               <w:jc w:val="center"/>
               <w:rPr>
+                <w:bCs/>
                 <w:sz w:val="22"/>
               </w:rPr>
             </w:pPr>
+            <w:r>
+              <w:rPr>
+                <w:bCs/>
+                <w:sz w:val="22"/>
+              </w:rPr>
+              <w:t>{{</w:t>
+            </w:r>
+            <w:proofErr w:type="spellStart"/>
+            <w:r>
+              <w:rPr>
+                <w:bCs/>
+                <w:sz w:val="22"/>
+              </w:rPr>
+              <w:t>Scores</w:t>
+            </w:r>
+            <w:r>
+              <w:rPr>
+                <w:bCs/>
+                <w:sz w:val="22"/>
+              </w:rPr>
+              <w:t>.</w:t>
+            </w:r>
+            <w:r>
+              <w:rPr>
+                <w:bCs/>
+                <w:sz w:val="22"/>
+              </w:rPr>
+              <w:t>TestDateAt</w:t>
+            </w:r>
+            <w:proofErr w:type="spellEnd"/>
+            <w:r>
+              <w:rPr>
+                <w:bCs/>
+                <w:sz w:val="22"/>
+              </w:rPr>
+              <w:t>}}</w:t>
+            </w:r>
           </w:p>
         </w:tc>
         <w:tc>
           <w:tcPr>
-            <w:tcW w:w="1950" w:type="dxa"/>
-            <w:vAlign w:val="center"/>
-          </w:tcPr>
-          <w:p>
-            <w:pPr>
-              <w:jc w:val="center"/>
-            </w:pPr>
-          </w:p>
-        </w:tc>
-        <w:tc>
-          <w:tcPr>
-            <w:tcW w:w="1884" w:type="dxa"/>
-            <w:vAlign w:val="center"/>
-          </w:tcPr>
-          <w:p>
-            <w:pPr>
-              <w:jc w:val="center"/>
-            </w:pPr>
-          </w:p>
-        </w:tc>
-        <w:tc>
-          <w:tcPr>
-            <w:tcW w:w="4426" w:type="dxa"/>
-            <w:vAlign w:val="center"/>
-          </w:tcPr>
-          <w:p/>
-        </w:tc>
-      </w:tr>
-      <w:tr>
-        <w:trPr>
-          <w:jc w:val="center"/>
-        </w:trPr>
-        <w:tc>
-          <w:tcPr>
-            <w:tcW w:w="1928" w:type="dxa"/>
+            <w:tcW w:w="1890" w:type="dxa"/>
             <w:vAlign w:val="center"/>
           </w:tcPr>
           <w:p>
             <w:pPr>
               <w:jc w:val="center"/>
               <w:rPr>
+                <w:bCs/>
                 <w:sz w:val="22"/>
               </w:rPr>
             </w:pPr>
+            <w:r>
+              <w:rPr>
+                <w:bCs/>
+                <w:sz w:val="22"/>
+              </w:rPr>
+              <w:t>{{</w:t>
+            </w:r>
+            <w:proofErr w:type="spellStart"/>
+            <w:r>
+              <w:rPr>
+                <w:bCs/>
+                <w:sz w:val="22"/>
+              </w:rPr>
+              <w:t>Scores</w:t>
+            </w:r>
+            <w:r>
+              <w:rPr>
+                <w:bCs/>
+                <w:sz w:val="22"/>
+              </w:rPr>
+              <w:t>.</w:t>
+            </w:r>
+            <w:r>
+              <w:rPr>
+                <w:bCs/>
+                <w:sz w:val="22"/>
+              </w:rPr>
+              <w:t>Shift</w:t>
+            </w:r>
+            <w:proofErr w:type="spellEnd"/>
+            <w:r>
+              <w:rPr>
+                <w:bCs/>
+                <w:sz w:val="22"/>
+              </w:rPr>
+              <w:t>}}</w:t>
+            </w:r>
           </w:p>
         </w:tc>
         <w:tc>
           <w:tcPr>
-            <w:tcW w:w="1950" w:type="dxa"/>
+            <w:tcW w:w="4320" w:type="dxa"/>
             <w:vAlign w:val="center"/>
           </w:tcPr>
           <w:p>
             <w:pPr>
-              <w:jc w:val="center"/>
-            </w:pPr>
-          </w:p>
-        </w:tc>
-        <w:tc>
-          <w:tcPr>
-            <w:tcW w:w="1884" w:type="dxa"/>
-            <w:vAlign w:val="center"/>
-          </w:tcPr>
-          <w:p>
-            <w:pPr>
-              <w:jc w:val="center"/>
-            </w:pPr>
-          </w:p>
-        </w:tc>
-        <w:tc>
-          <w:tcPr>
-            <w:tcW w:w="4426" w:type="dxa"/>
-            <w:vAlign w:val="center"/>
-          </w:tcPr>
-          <w:p/>
-        </w:tc>
-      </w:tr>
-      <w:tr>
-        <w:trPr>
-          <w:jc w:val="center"/>
-        </w:trPr>
-        <w:tc>
-          <w:tcPr>
-            <w:tcW w:w="1928" w:type="dxa"/>
-            <w:vAlign w:val="center"/>
-          </w:tcPr>
-          <w:p>
-            <w:pPr>
-              <w:jc w:val="center"/>
               <w:rPr>
+                <w:bCs/>
                 <w:sz w:val="22"/>
               </w:rPr>
             </w:pPr>
-          </w:p>
-        </w:tc>
-        <w:tc>
-          <w:tcPr>
-            <w:tcW w:w="1950" w:type="dxa"/>
-            <w:vAlign w:val="center"/>
-          </w:tcPr>
-          <w:p>
-            <w:pPr>
-              <w:jc w:val="center"/>
-            </w:pPr>
-          </w:p>
-        </w:tc>
-        <w:tc>
-          <w:tcPr>
-            <w:tcW w:w="1884" w:type="dxa"/>
-            <w:vAlign w:val="center"/>
-          </w:tcPr>
-          <w:p>
-            <w:pPr>
-              <w:jc w:val="center"/>
-            </w:pPr>
-          </w:p>
-        </w:tc>
-        <w:tc>
-          <w:tcPr>
-            <w:tcW w:w="4426" w:type="dxa"/>
-            <w:vAlign w:val="center"/>
-          </w:tcPr>
-          <w:p/>
-        </w:tc>
-      </w:tr>
-      <w:tr>
-        <w:trPr>
-          <w:jc w:val="center"/>
-        </w:trPr>
-        <w:tc>
-          <w:tcPr>
-            <w:tcW w:w="1928" w:type="dxa"/>
-            <w:vAlign w:val="center"/>
-          </w:tcPr>
-          <w:p>
-            <w:pPr>
-              <w:jc w:val="center"/>
+            <w:r>
               <w:rPr>
+                <w:bCs/>
                 <w:sz w:val="22"/>
               </w:rPr>
-            </w:pPr>
+              <w:t>{{</w:t>
+            </w:r>
+            <w:proofErr w:type="spellStart"/>
+            <w:r>
+              <w:rPr>
+                <w:bCs/>
+                <w:sz w:val="22"/>
+              </w:rPr>
+              <w:t>Scores</w:t>
+            </w:r>
+            <w:r>
+              <w:rPr>
+                <w:bCs/>
+                <w:sz w:val="22"/>
+              </w:rPr>
+              <w:t>.</w:t>
+            </w:r>
+            <w:r>
+              <w:rPr>
+                <w:bCs/>
+                <w:sz w:val="22"/>
+              </w:rPr>
+              <w:t>NoteContent</w:t>
+            </w:r>
+            <w:proofErr w:type="spellEnd"/>
+            <w:r>
+              <w:rPr>
+                <w:bCs/>
+                <w:sz w:val="22"/>
+              </w:rPr>
+              <w:t>}}</w:t>
+            </w:r>
           </w:p>
-        </w:tc>
-        <w:tc>
-          <w:tcPr>
-            <w:tcW w:w="1950" w:type="dxa"/>
-            <w:vAlign w:val="center"/>
-          </w:tcPr>
-          <w:p>
-            <w:pPr>
-              <w:jc w:val="center"/>
-            </w:pPr>
-          </w:p>
-        </w:tc>
-        <w:tc>
-          <w:tcPr>
-            <w:tcW w:w="1884" w:type="dxa"/>
-            <w:vAlign w:val="center"/>
-          </w:tcPr>
-          <w:p>
-            <w:pPr>
-              <w:jc w:val="center"/>
-            </w:pPr>
-          </w:p>
-        </w:tc>
-        <w:tc>
-          <w:tcPr>
-            <w:tcW w:w="4426" w:type="dxa"/>
-            <w:vAlign w:val="center"/>
-          </w:tcPr>
-          <w:p/>
         </w:tc>
       </w:tr>
     </w:tbl>
@@ -895,49 +732,7 @@
         <w:rPr>
           <w:i/>
         </w:rPr>
-        <w:t xml:space="preserve"> </w:t>
-      </w:r>
-      <w:proofErr w:type="spellStart"/>
-      <w:r>
-        <w:rPr>
-          <w:i/>
-        </w:rPr>
-        <w:t>tên</w:t>
-      </w:r>
-      <w:proofErr w:type="spellEnd"/>
-      <w:r>
-        <w:rPr>
-          <w:i/>
-        </w:rPr>
-        <w:t xml:space="preserve"> </w:t>
-      </w:r>
-      <w:proofErr w:type="spellStart"/>
-      <w:r>
-        <w:rPr>
-          <w:i/>
-        </w:rPr>
-        <w:t>xác</w:t>
-      </w:r>
-      <w:proofErr w:type="spellEnd"/>
-      <w:r>
-        <w:rPr>
-          <w:i/>
-        </w:rPr>
-        <w:t xml:space="preserve"> </w:t>
-      </w:r>
-      <w:proofErr w:type="spellStart"/>
-      <w:r>
-        <w:rPr>
-          <w:i/>
-        </w:rPr>
-        <w:t>nhận</w:t>
-      </w:r>
-      <w:proofErr w:type="spellEnd"/>
-      <w:r>
-        <w:rPr>
-          <w:i/>
-        </w:rPr>
-        <w:t>)</w:t>
+        <w:t xml:space="preserve"> tên xác nhận)</w:t>
       </w:r>
     </w:p>
     <w:p>

</xml_diff>